<commit_message>
feat(admin): HU-9.2 previsao de volume + HU-9.3 deteccao de anomalias
HU-9.2 (Previsao):
- forecastVolume: tendencia linear + sazonalidade semanal + IC 95%
- useVolumeForecast: busca 60d de urban+transport e aplica forecast
- /admin/previsoes com toggle 7/14/30 dias
- ForecastSummaryCards (delta vs baseline), ForecastChart e ForecastTable

HU-9.3 (Anomalias):
- Migration report_anomalies + RLS admin/gestor + realtime
- detectAnomalies: z-score sobre observed vs forecast (reusa HU-9.2)
- Edge function detect-anomalies com dupla auth (X-Cron-Secret OU JWT admin/gestor)
- useReportAnomalies: filtros + realtime + acknowledge/dismiss/notes + runDetection
- /admin/anomalias com KPIs, tabela e drawer de detalhes
- Sidebar: itens Previsoes e Anomalias

Testes:
- forecastVolume.test.ts (16 casos: slope, sazonalidade, IC, edge cases)
- detectAnomalies.test.ts (14 casos: spike/drop, severidade, threshold, janela)
</commit_message>
<xml_diff>
--- a/docs/comparativo-google-places-subset-cohort.docx
+++ b/docs/comparativo-google-places-subset-cohort.docx
@@ -169,7 +169,7 @@
           </w:tcPr>
           <w:p>
             <w:r>
-              <w:t>Escola (4 camadas SME/GeoSampa)</w:t>
+              <w:t>Escola (4 camadas GeoSampa)</w:t>
             </w:r>
           </w:p>
         </w:tc>
@@ -179,7 +179,29 @@
           </w:tcPr>
           <w:p>
             <w:r>
-              <w:t>school + ensino_fundamental_medio, educacao_infantil, ensino_tecnico, senai_sesi_senac</w:t>
+              <w:t>school + ensino_fundamental_medio, educacao_infantil, ensino_tecnico, senai_sesi_senac (ver §1.1)</w:t>
+            </w:r>
+          </w:p>
+        </w:tc>
+      </w:tr>
+      <w:tr>
+        <w:tc>
+          <w:tcPr>
+            <w:tcW w:type="dxa" w:w="4320"/>
+          </w:tcPr>
+          <w:p>
+            <w:r>
+              <w:t>Saúde (hospitais, UPAs e afins no mapa)</w:t>
+            </w:r>
+          </w:p>
+        </w:tc>
+        <w:tc>
+          <w:tcPr>
+            <w:tcW w:type="dxa" w:w="4320"/>
+          </w:tcPr>
+          <w:p>
+            <w:r>
+              <w:t>service_type = hospital + source_layer GeoSampa (ver §1.2)</w:t>
             </w:r>
           </w:p>
         </w:tc>
@@ -209,10 +231,370 @@
     </w:tbl>
     <w:p>
       <w:pPr>
+        <w:pStyle w:val="Heading2"/>
+      </w:pPr>
+      <w:r>
+        <w:t>1.1. Escolas — quatro camadas GeoSampa</w:t>
+      </w:r>
+    </w:p>
+    <w:p>
+      <w:pPr>
+        <w:jc w:val="both"/>
+      </w:pPr>
+      <w:r>
+        <w:t>Entram apenas POIs com service_type = school e source_layer igual a um dos valores da tabela (WFS GeoSampa → public_services). Fora do recorte: rede_privada, educacao_outros, escolas só da API Escola Aberta sem layer compatível, etc.</w:t>
+      </w:r>
+    </w:p>
+    <w:tbl>
+      <w:tblPr>
+        <w:tblStyle w:val="TableGrid"/>
+        <w:tblW w:type="auto" w:w="0"/>
+        <w:tblLook w:firstColumn="1" w:firstRow="1" w:lastColumn="0" w:lastRow="0" w:noHBand="0" w:noVBand="1" w:val="04A0"/>
+      </w:tblPr>
+      <w:tblGrid>
+        <w:gridCol w:w="4320"/>
+        <w:gridCol w:w="4320"/>
+      </w:tblGrid>
+      <w:tr>
+        <w:tc>
+          <w:tcPr>
+            <w:tcW w:type="dxa" w:w="4320"/>
+          </w:tcPr>
+          <w:p>
+            <w:r>
+              <w:rPr>
+                <w:b/>
+              </w:rPr>
+              <w:t>source_layer</w:t>
+            </w:r>
+          </w:p>
+        </w:tc>
+        <w:tc>
+          <w:tcPr>
+            <w:tcW w:type="dxa" w:w="4320"/>
+          </w:tcPr>
+          <w:p>
+            <w:r>
+              <w:rPr>
+                <w:b/>
+              </w:rPr>
+              <w:t>O que representa (resumo)</w:t>
+            </w:r>
+          </w:p>
+        </w:tc>
+      </w:tr>
+      <w:tr>
+        <w:tc>
+          <w:tcPr>
+            <w:tcW w:type="dxa" w:w="4320"/>
+          </w:tcPr>
+          <w:p>
+            <w:r>
+              <w:t>ensino_fundamental_medio</w:t>
+            </w:r>
+          </w:p>
+        </w:tc>
+        <w:tc>
+          <w:tcPr>
+            <w:tcW w:type="dxa" w:w="4320"/>
+          </w:tcPr>
+          <w:p>
+            <w:r>
+              <w:t>Ensino fundamental e médio rede pública (equipamento_educacao_rede_publica).</w:t>
+            </w:r>
+          </w:p>
+        </w:tc>
+      </w:tr>
+      <w:tr>
+        <w:tc>
+          <w:tcPr>
+            <w:tcW w:type="dxa" w:w="4320"/>
+          </w:tcPr>
+          <w:p>
+            <w:r>
+              <w:t>educacao_infantil</w:t>
+            </w:r>
+          </w:p>
+        </w:tc>
+        <w:tc>
+          <w:tcPr>
+            <w:tcW w:type="dxa" w:w="4320"/>
+          </w:tcPr>
+          <w:p>
+            <w:r>
+              <w:t>Educação infantil rede pública (equipamento_educacao_infantil_rede_publica).</w:t>
+            </w:r>
+          </w:p>
+        </w:tc>
+      </w:tr>
+      <w:tr>
+        <w:tc>
+          <w:tcPr>
+            <w:tcW w:type="dxa" w:w="4320"/>
+          </w:tcPr>
+          <w:p>
+            <w:r>
+              <w:t>ensino_tecnico</w:t>
+            </w:r>
+          </w:p>
+        </w:tc>
+        <w:tc>
+          <w:tcPr>
+            <w:tcW w:type="dxa" w:w="4320"/>
+          </w:tcPr>
+          <w:p>
+            <w:r>
+              <w:t>Ensino técnico rede pública (equipamento_educacao_ensino_tecnico_rede_publica).</w:t>
+            </w:r>
+          </w:p>
+        </w:tc>
+      </w:tr>
+      <w:tr>
+        <w:tc>
+          <w:tcPr>
+            <w:tcW w:type="dxa" w:w="4320"/>
+          </w:tcPr>
+          <w:p>
+            <w:r>
+              <w:t>senai_sesi_senac</w:t>
+            </w:r>
+          </w:p>
+        </w:tc>
+        <w:tc>
+          <w:tcPr>
+            <w:tcW w:type="dxa" w:w="4320"/>
+          </w:tcPr>
+          <w:p>
+            <w:r>
+              <w:t>SENAI / SESI / SENAC (equipamento_educacao_senai_sesi_senac).</w:t>
+            </w:r>
+          </w:p>
+        </w:tc>
+      </w:tr>
+    </w:tbl>
+    <w:p>
+      <w:pPr>
+        <w:pStyle w:val="Heading2"/>
+      </w:pPr>
+      <w:r>
+        <w:t>1.2. Saúde — service_type hospital (hospitais, UPAs e afins)</w:t>
+      </w:r>
+    </w:p>
+    <w:p>
+      <w:pPr>
+        <w:jc w:val="both"/>
+      </w:pPr>
+      <w:r>
+        <w:t>No mapa, hospitais, unidades de urgência/emergência (perfil tipo UPA conforme cadastro GeoSampa) e unidades afins ficam em service_type = hospital, distinguindo-se pelo source_layer.</w:t>
+      </w:r>
+    </w:p>
+    <w:tbl>
+      <w:tblPr>
+        <w:tblStyle w:val="TableGrid"/>
+        <w:tblW w:type="auto" w:w="0"/>
+        <w:tblLook w:firstColumn="1" w:firstRow="1" w:lastColumn="0" w:lastRow="0" w:noHBand="0" w:noVBand="1" w:val="04A0"/>
+      </w:tblPr>
+      <w:tblGrid>
+        <w:gridCol w:w="4320"/>
+        <w:gridCol w:w="4320"/>
+      </w:tblGrid>
+      <w:tr>
+        <w:tc>
+          <w:tcPr>
+            <w:tcW w:type="dxa" w:w="4320"/>
+          </w:tcPr>
+          <w:p>
+            <w:r>
+              <w:rPr>
+                <w:b/>
+              </w:rPr>
+              <w:t>source_layer</w:t>
+            </w:r>
+          </w:p>
+        </w:tc>
+        <w:tc>
+          <w:tcPr>
+            <w:tcW w:type="dxa" w:w="4320"/>
+          </w:tcPr>
+          <w:p>
+            <w:r>
+              <w:rPr>
+                <w:b/>
+              </w:rPr>
+              <w:t>O que representa (resumo)</w:t>
+            </w:r>
+          </w:p>
+        </w:tc>
+      </w:tr>
+      <w:tr>
+        <w:tc>
+          <w:tcPr>
+            <w:tcW w:type="dxa" w:w="4320"/>
+          </w:tcPr>
+          <w:p>
+            <w:r>
+              <w:t>urgencia_emergencia</w:t>
+            </w:r>
+          </w:p>
+        </w:tc>
+        <w:tc>
+          <w:tcPr>
+            <w:tcW w:type="dxa" w:w="4320"/>
+          </w:tcPr>
+          <w:p>
+            <w:r>
+              <w:t>Urgência e emergência (inclui perfil tipo UPA / atenção 24h conforme GeoSampa).</w:t>
+            </w:r>
+          </w:p>
+        </w:tc>
+      </w:tr>
+      <w:tr>
+        <w:tc>
+          <w:tcPr>
+            <w:tcW w:type="dxa" w:w="4320"/>
+          </w:tcPr>
+          <w:p>
+            <w:r>
+              <w:t>hospital</w:t>
+            </w:r>
+          </w:p>
+        </w:tc>
+        <w:tc>
+          <w:tcPr>
+            <w:tcW w:type="dxa" w:w="4320"/>
+          </w:tcPr>
+          <w:p>
+            <w:r>
+              <w:t>Hospitais.</w:t>
+            </w:r>
+          </w:p>
+        </w:tc>
+      </w:tr>
+      <w:tr>
+        <w:tc>
+          <w:tcPr>
+            <w:tcW w:type="dxa" w:w="4320"/>
+          </w:tcPr>
+          <w:p>
+            <w:r>
+              <w:t>equipamento_saude_ambulatorios_especializados</w:t>
+            </w:r>
+          </w:p>
+        </w:tc>
+        <w:tc>
+          <w:tcPr>
+            <w:tcW w:type="dxa" w:w="4320"/>
+          </w:tcPr>
+          <w:p>
+            <w:r>
+              <w:t>Ambulatórios especializados.</w:t>
+            </w:r>
+          </w:p>
+        </w:tc>
+      </w:tr>
+      <w:tr>
+        <w:tc>
+          <w:tcPr>
+            <w:tcW w:type="dxa" w:w="4320"/>
+          </w:tcPr>
+          <w:p>
+            <w:r>
+              <w:t>equipamento_saude_saude_mental</w:t>
+            </w:r>
+          </w:p>
+        </w:tc>
+        <w:tc>
+          <w:tcPr>
+            <w:tcW w:type="dxa" w:w="4320"/>
+          </w:tcPr>
+          <w:p>
+            <w:r>
+              <w:t>Equipamentos de saúde mental.</w:t>
+            </w:r>
+          </w:p>
+        </w:tc>
+      </w:tr>
+      <w:tr>
+        <w:tc>
+          <w:tcPr>
+            <w:tcW w:type="dxa" w:w="4320"/>
+          </w:tcPr>
+          <w:p>
+            <w:r>
+              <w:t>equipamento_ccz</w:t>
+            </w:r>
+          </w:p>
+        </w:tc>
+        <w:tc>
+          <w:tcPr>
+            <w:tcW w:type="dxa" w:w="4320"/>
+          </w:tcPr>
+          <w:p>
+            <w:r>
+              <w:t>Centro de Controle de Zoonoses (CCZ).</w:t>
+            </w:r>
+          </w:p>
+        </w:tc>
+      </w:tr>
+      <w:tr>
+        <w:tc>
+          <w:tcPr>
+            <w:tcW w:type="dxa" w:w="4320"/>
+          </w:tcPr>
+          <w:p>
+            <w:r>
+              <w:t>equipamento_saude_outros</w:t>
+            </w:r>
+          </w:p>
+        </w:tc>
+        <w:tc>
+          <w:tcPr>
+            <w:tcW w:type="dxa" w:w="4320"/>
+          </w:tcPr>
+          <w:p>
+            <w:r>
+              <w:t>Outros equipamentos de saúde nesta família.</w:t>
+            </w:r>
+          </w:p>
+        </w:tc>
+      </w:tr>
+      <w:tr>
+        <w:tc>
+          <w:tcPr>
+            <w:tcW w:type="dxa" w:w="4320"/>
+          </w:tcPr>
+          <w:p>
+            <w:r>
+              <w:t>equipamento_saude_unidades_dst_aids</w:t>
+            </w:r>
+          </w:p>
+        </w:tc>
+        <w:tc>
+          <w:tcPr>
+            <w:tcW w:type="dxa" w:w="4320"/>
+          </w:tcPr>
+          <w:p>
+            <w:r>
+              <w:t>Unidades DST / AIDS.</w:t>
+            </w:r>
+          </w:p>
+        </w:tc>
+      </w:tr>
+    </w:tbl>
+    <w:p>
+      <w:pPr>
+        <w:jc w:val="both"/>
+      </w:pPr>
+      <w:r>
+        <w:t>Outros source_layer ainda com service_type = hospital aparecem na 1.ª query do SQL como cohort hospital_source_layer_outros (auditoria).</w:t>
+      </w:r>
+    </w:p>
+    <w:p>
+      <w:pPr>
         <w:pStyle w:val="Heading1"/>
       </w:pPr>
       <w:r>
-        <w:t>2. Contagens só por service_type (Marco C, alinhado ao comparativo geral)</w:t>
+        <w:t>2. Contagens por grupo (Marco C, alinhado ao comparativo geral)</w:t>
       </w:r>
     </w:p>
     <w:tbl>
@@ -249,6 +631,50 @@
                 <w:b/>
               </w:rPr>
               <w:t>N</w:t>
+            </w:r>
+          </w:p>
+        </w:tc>
+      </w:tr>
+      <w:tr>
+        <w:tc>
+          <w:tcPr>
+            <w:tcW w:type="dxa" w:w="4320"/>
+          </w:tcPr>
+          <w:p>
+            <w:r>
+              <w:t>Escola (4 camadas, §1.1)</w:t>
+            </w:r>
+          </w:p>
+        </w:tc>
+        <w:tc>
+          <w:tcPr>
+            <w:tcW w:type="dxa" w:w="4320"/>
+          </w:tcPr>
+          <w:p>
+            <w:r>
+              <w:t>57.962</w:t>
+            </w:r>
+          </w:p>
+        </w:tc>
+      </w:tr>
+      <w:tr>
+        <w:tc>
+          <w:tcPr>
+            <w:tcW w:type="dxa" w:w="4320"/>
+          </w:tcPr>
+          <w:p>
+            <w:r>
+              <w:t>Transporte (metrô + trem + terminal)</w:t>
+            </w:r>
+          </w:p>
+        </w:tc>
+        <w:tc>
+          <w:tcPr>
+            <w:tcW w:type="dxa" w:w="4320"/>
+          </w:tcPr>
+          <w:p>
+            <w:r>
+              <w:t>13.199</w:t>
             </w:r>
           </w:p>
         </w:tc>
@@ -385,13 +811,57 @@
           </w:p>
         </w:tc>
       </w:tr>
+      <w:tr>
+        <w:tc>
+          <w:tcPr>
+            <w:tcW w:type="dxa" w:w="4320"/>
+          </w:tcPr>
+          <w:p>
+            <w:r>
+              <w:t>Saúde (hospital / UPA / afins, §1.2)</w:t>
+            </w:r>
+          </w:p>
+        </w:tc>
+        <w:tc>
+          <w:tcPr>
+            <w:tcW w:type="dxa" w:w="4320"/>
+          </w:tcPr>
+          <w:p>
+            <w:r>
+              <w:t>699</w:t>
+            </w:r>
+          </w:p>
+        </w:tc>
+      </w:tr>
+      <w:tr>
+        <w:tc>
+          <w:tcPr>
+            <w:tcW w:type="dxa" w:w="4320"/>
+          </w:tcPr>
+          <w:p>
+            <w:r>
+              <w:t>Total</w:t>
+            </w:r>
+          </w:p>
+        </w:tc>
+        <w:tc>
+          <w:tcPr>
+            <w:tcW w:type="dxa" w:w="4320"/>
+          </w:tcPr>
+          <w:p>
+            <w:r>
+              <w:t>80.079</w:t>
+            </w:r>
+          </w:p>
+        </w:tc>
+      </w:tr>
     </w:tbl>
     <w:p>
       <w:pPr>
         <w:jc w:val="both"/>
       </w:pPr>
       <w:r>
-        <w:t>Metrô, trem, terminal e as quatro linhas de escola contam na primeira query do SQL (por coorte); entram na soma N total abaixo.</w:t>
+        <w:t>Detalhe por coorte (transit_*, school_*, hospital_*, etc.): 1.ª SELECT em diagnostic-google-places-subset-cohort.sql.</w:t>
       </w:r>
     </w:p>
     <w:p>
@@ -413,7 +883,7 @@
         <w:t xml:space="preserve">Fórmula: </w:t>
       </w:r>
       <w:r>
-        <w:t>max(0, N − 1.000) × 0,025 USD; BRL = USD × 5,50.</w:t>
+        <w:t>max(0, N − 1.000) × 0,025 USD; BRL = USD × 5,50 (2.ª query SQL).</w:t>
       </w:r>
     </w:p>
     <w:tbl>
@@ -471,7 +941,7 @@
           </w:tcPr>
           <w:p>
             <w:r>
-              <w:t>79.380</w:t>
+              <w:t>80.079</w:t>
             </w:r>
           </w:p>
         </w:tc>
@@ -493,7 +963,7 @@
           </w:tcPr>
           <w:p>
             <w:r>
-              <w:t>1.959,50</w:t>
+              <w:t>1.976,98</w:t>
             </w:r>
           </w:p>
         </w:tc>
@@ -515,7 +985,7 @@
           </w:tcPr>
           <w:p>
             <w:r>
-              <w:t>10.777,25</w:t>
+              <w:t>10.873,36</w:t>
             </w:r>
           </w:p>
         </w:tc>
@@ -526,7 +996,7 @@
         <w:jc w:val="both"/>
       </w:pPr>
       <w:r>
-        <w:t>(79.380 − 1.000) × 0,025 = 1.959,50 USD.</w:t>
+        <w:t>(80.079 − 1.000) × 0,025 = 1.976,98 USD; × 5,50 = 10.873,36 BRL.</w:t>
       </w:r>
     </w:p>
     <w:p>

</xml_diff>